<commit_message>
Rebrand to LightRailAI and update documentation
</commit_message>
<xml_diff>
--- a/LightRail_15Layer_Intelligence_Stack.docx
+++ b/LightRail_15Layer_Intelligence_Stack.docx
@@ -1499,7 +1499,112 @@
         <w:pStyle w:val="Heading2"/>
       </w:pPr>
       <w:r>
-        <w:t>5.3 Cable and Fiber Infrastructure</w:t>
+        <w:t>5.3 Assembly, Wiring, and Routing</w:t>
+      </w:r>
+    </w:p>
+    <w:p>
+      <w:r>
+        <w:t>The LightRailAI CPO Interconnect requires high-precision assembly and specialized wire bonding for the TFLN modulator (U1) and photodetector (U3) dies.</w:t>
+      </w:r>
+    </w:p>
+    <w:p>
+      <w:r>
+        <w:t>Figure 7: Manufacturing Assembly Diagram</w:t>
+      </w:r>
+    </w:p>
+    <w:p>
+      <w:r>
+        <w:drawing>
+          <wp:inline xmlns:a="http://schemas.openxmlformats.org/drawingml/2006/main" xmlns:pic="http://schemas.openxmlformats.org/drawingml/2006/picture">
+            <wp:extent cx="5486400" cy="7491190"/>
+            <wp:docPr id="7" name="Picture 7"/>
+            <wp:cNvGraphicFramePr>
+              <a:graphicFrameLocks noChangeAspect="1"/>
+            </wp:cNvGraphicFramePr>
+            <a:graphic>
+              <a:graphicData uri="http://schemas.openxmlformats.org/drawingml/2006/picture">
+                <pic:pic>
+                  <pic:nvPicPr>
+                    <pic:cNvPr id="0" name="LightRail_Assembly_Drawing.png"/>
+                    <pic:cNvPicPr/>
+                  </pic:nvPicPr>
+                  <pic:blipFill>
+                    <a:blip r:embed="rId15"/>
+                    <a:stretch>
+                      <a:fillRect/>
+                    </a:stretch>
+                  </pic:blipFill>
+                  <pic:spPr>
+                    <a:xfrm>
+                      <a:off x="0" y="0"/>
+                      <a:ext cx="5486400" cy="7491190"/>
+                    </a:xfrm>
+                    <a:prstGeom prst="rect"/>
+                  </pic:spPr>
+                </pic:pic>
+              </a:graphicData>
+            </a:graphic>
+          </wp:inline>
+        </w:drawing>
+      </w:r>
+    </w:p>
+    <w:p>
+      <w:r>
+        <w:t>The drawing above specifies component locations, tech characteristics, and critical notes for gold-wire wedge bonding.</w:t>
+      </w:r>
+    </w:p>
+    <w:p>
+      <w:r>
+        <w:t>Figure 8: Critical Routing Topology (L1 &amp; L3)</w:t>
+      </w:r>
+    </w:p>
+    <w:p>
+      <w:r>
+        <w:drawing>
+          <wp:inline xmlns:a="http://schemas.openxmlformats.org/drawingml/2006/main" xmlns:pic="http://schemas.openxmlformats.org/drawingml/2006/picture">
+            <wp:extent cx="5486400" cy="2743200"/>
+            <wp:docPr id="8" name="Picture 8"/>
+            <wp:cNvGraphicFramePr>
+              <a:graphicFrameLocks noChangeAspect="1"/>
+            </wp:cNvGraphicFramePr>
+            <a:graphic>
+              <a:graphicData uri="http://schemas.openxmlformats.org/drawingml/2006/picture">
+                <pic:pic>
+                  <pic:nvPicPr>
+                    <pic:cNvPr id="0" name="LightRailAI_Routing_View.png"/>
+                    <pic:cNvPicPr/>
+                  </pic:nvPicPr>
+                  <pic:blipFill>
+                    <a:blip r:embed="rId16"/>
+                    <a:stretch>
+                      <a:fillRect/>
+                    </a:stretch>
+                  </pic:blipFill>
+                  <pic:spPr>
+                    <a:xfrm>
+                      <a:off x="0" y="0"/>
+                      <a:ext cx="5486400" cy="2743200"/>
+                    </a:xfrm>
+                    <a:prstGeom prst="rect"/>
+                  </pic:spPr>
+                </pic:pic>
+              </a:graphicData>
+            </a:graphic>
+          </wp:inline>
+        </w:drawing>
+      </w:r>
+    </w:p>
+    <w:p>
+      <w:r>
+        <w:t>Critical routing is performed on Layer 1 (50 ohm RF) and Layer 3 (85 ohm Diff) using Rogers 4350B dielectric for matched impedance and low-loss propagation.</w:t>
+      </w:r>
+    </w:p>
+    <w:p>
+      <w:pPr>
+        <w:pStyle w:val="Heading2"/>
+      </w:pPr>
+      <w:r>
+        <w:t>5.4 Cable and Fiber Infrastructure</w:t>
       </w:r>
     </w:p>
     <w:p>

</xml_diff>